<commit_message>
Meeting 4: shorten norms/roles review to 5 min, extend foundation step to 20 min
First step (Review norms and roles) trimmed 10→5 min; the freed 5 minutes move to
'Finalize your team foundation' (15→20 min), which now directs teams to use the
readiness checklist on the back of the agenda to confirm every Meeting 1–4 task is
complete. Regenerated the Meeting 4 agenda PDF + Word.

Co-Authored-By: Claude Opus 4.8 <noreply@anthropic.com>
</commit_message>
<xml_diff>
--- a/public/agendas/ems-meeting-4-agenda.docx
+++ b/public/agendas/ems-meeting-4-agenda.docx
@@ -499,7 +499,7 @@
                 <w:sz w:val="22"/>
                 <w:szCs w:val="22"/>
               </w:rPr>
-              <w:t xml:space="preserve">0–10 min</w:t>
+              <w:t xml:space="preserve">0–5 min</w:t>
             </w:r>
           </w:p>
         </w:tc>
@@ -563,7 +563,7 @@
                 <w:sz w:val="22"/>
                 <w:szCs w:val="22"/>
               </w:rPr>
-              <w:t xml:space="preserve">10–25 min</w:t>
+              <w:t xml:space="preserve">5–25 min</w:t>
             </w:r>
           </w:p>
         </w:tc>
@@ -591,7 +591,7 @@
                 <w:sz w:val="22"/>
                 <w:szCs w:val="22"/>
               </w:rPr>
-              <w:t xml:space="preserve">Finalize your team foundation. Refine the roles and norms you drafted in Meeting 2, and complete the Holding Each Other Accountable worksheet if it was a first pass. This locks in how you'll work before content begins.</w:t>
+              <w:t xml:space="preserve">Finalize your team foundation. Refine the roles and norms you drafted in Meeting 2, and complete the Holding Each Other Accountable worksheet if it was a first pass. Use the readiness checklist on the back of this agenda to check off and confirm every task from Meetings 1–4 is complete. This locks in how you'll work before content begins.</w:t>
             </w:r>
           </w:p>
         </w:tc>

</xml_diff>

<commit_message>
Meeting 4: remove Four Questions readiness assessment; center on foundation + checklist
Teams have no cycle experience at Meeting 4, so a forward-looking self-assessment
on the four critical questions reads as guesswork. Removed it; Meeting 4 now
finalizes the foundation and confirms it against the Meetings 1-4 checklist (its
own agenda step). The honest, experience-based read on the four questions stays at
Meeting 18 (Critical Issues). Updated the agenda, directions, product, and the
staff one-pager checklist; regenerated the M4 agenda and staff one-pager.

Co-Authored-By: Claude Opus 4.8 <noreply@anthropic.com>
</commit_message>
<xml_diff>
--- a/public/agendas/ems-meeting-4-agenda.docx
+++ b/public/agendas/ems-meeting-4-agenda.docx
@@ -154,7 +154,7 @@
           <w:sz w:val="22"/>
           <w:szCs w:val="22"/>
         </w:rPr>
-        <w:t xml:space="preserve">Then the team looks forward: the Four Critical Questions readiness tool gives an honest read on where you're ready for the cycle and where you still need support — so no one moves into the content work pretending. The standards work itself begins next time, at Meeting 5.</w:t>
+        <w:t xml:space="preserve">Then the team confirms it's ready: work through the readiness checklist on the back of the agenda, check off every task from Meetings 1–4, and use the remaining time to close any gaps — finishing incomplete foundation work is exactly what this buffer is for. The four critical questions aren't self-assessed here; teams meet them as the cycle unfolds, and give the honest, experience-based read at the end of the year (Meeting 18). The standards work itself begins next time, at Meeting 5.</w:t>
       </w:r>
     </w:p>
     <w:tbl>
@@ -363,7 +363,7 @@
                 <w:sz w:val="22"/>
                 <w:szCs w:val="22"/>
               </w:rPr>
-              <w:t xml:space="preserve">A finalized team foundation and a completed readiness check for the cycle.</w:t>
+              <w:t xml:space="preserve">A finalized team foundation, confirmed complete against the Meetings 1–4 checklist.</w:t>
             </w:r>
           </w:p>
         </w:tc>
@@ -591,7 +591,7 @@
                 <w:sz w:val="22"/>
                 <w:szCs w:val="22"/>
               </w:rPr>
-              <w:t xml:space="preserve">Finalize your team foundation. Refine the roles and norms you drafted in Meeting 2, and complete the Holding Each Other Accountable worksheet if it was a first pass. Use the readiness checklist on the back of this agenda to check off and confirm every task from Meetings 1–4 is complete. This locks in how you'll work before content begins.</w:t>
+              <w:t xml:space="preserve">Finalize your team foundation. Refine the roles and norms you drafted in Meeting 2, and complete the Holding Each Other Accountable worksheet if it was a first pass. This locks in how you'll work before content begins.</w:t>
             </w:r>
           </w:p>
         </w:tc>
@@ -655,7 +655,7 @@
                 <w:sz w:val="22"/>
                 <w:szCs w:val="22"/>
               </w:rPr>
-              <w:t xml:space="preserve">Readiness check. Use the Four Critical Questions readiness tool to name, question by question, where the team is ready for the cycle and where it still needs support. Be honest — this is what keeps teams from moving forward while pretending.</w:t>
+              <w:t xml:space="preserve">Work the readiness checklist. Using the checklist on the back of this agenda, check off every task from Meetings 1–4. Use any remaining time to close the gaps — finishing anything that isn't done yet is exactly what this buffer meeting is for.</w:t>
             </w:r>
           </w:p>
         </w:tc>

</xml_diff>